<commit_message>
adicionando microSD e RTC
</commit_message>
<xml_diff>
--- a/Atividades/Atividade 1 - Template do relatorio.docx
+++ b/Atividades/Atividade 1 - Template do relatorio.docx
@@ -942,7 +942,21 @@
           <w:rFonts w:eastAsia="Google Sans Text"/>
           <w:color w:val="1B1C1D"/>
         </w:rPr>
-        <w:t xml:space="preserve"> a montagem do circuito DS18B20. Inclua um diagrama.</w:t>
+        <w:t xml:space="preserve"> a montagem do circuito DS18B20. Inclu</w:t>
+      </w:r>
+      <w:r>
+        <w:rPr>
+          <w:rFonts w:eastAsia="Google Sans Text"/>
+          <w:color w:val="1B1C1D"/>
+        </w:rPr>
+        <w:t>ir</w:t>
+      </w:r>
+      <w:r>
+        <w:rPr>
+          <w:rFonts w:eastAsia="Google Sans Text"/>
+          <w:color w:val="1B1C1D"/>
+        </w:rPr>
+        <w:t xml:space="preserve"> um diagrama.</w:t>
       </w:r>
       <w:r>
         <w:rPr>
@@ -1342,23 +1356,7 @@
           <w:rFonts w:eastAsia="Google Sans Text"/>
           <w:color w:val="1B1C1D"/>
         </w:rPr>
-        <w:t xml:space="preserve"> os desafios encontrados na implementação do protocolo de comunicação (</w:t>
-      </w:r>
-      <w:proofErr w:type="spellStart"/>
-      <w:r>
-        <w:rPr>
-          <w:rFonts w:eastAsia="Google Sans Text"/>
-          <w:color w:val="1B1C1D"/>
-        </w:rPr>
-        <w:t>parsing</w:t>
-      </w:r>
-      <w:proofErr w:type="spellEnd"/>
-      <w:r>
-        <w:rPr>
-          <w:rFonts w:eastAsia="Google Sans Text"/>
-          <w:color w:val="1B1C1D"/>
-        </w:rPr>
-        <w:t xml:space="preserve"> de comandos, sincronização) e as soluções adotadas.</w:t>
+        <w:t xml:space="preserve"> os desafios encontrados na implementação do protocolo de comunicação (parsing de comandos, sincronização) e as soluções adotadas.</w:t>
       </w:r>
       <w:r>
         <w:rPr>

</xml_diff>